<commit_message>
Serve the résumé as a PDF and match its tool names to the site.
Co-authored-by: Cursor <cursoragent@cursor.com>
</commit_message>
<xml_diff>
--- a/public/Bill-Hauver-Resume.docx
+++ b/public/Bill-Hauver-Resume.docx
@@ -84,7 +84,7 @@
           <w:sz w:val="20"/>
           <w:szCs w:val="20"/>
         </w:rPr>
-        <w:t xml:space="preserve">Senior IT leader with 30+ years of experience spanning DevOps, cloud infrastructure, software architecture, and quality assurance, including 10+ years in senior management. Proven record of building and scaling technical teams of up to 45 people (onshore/offshore) and modernizing enterprise systems for Fortune 500 organizations. Skilled at turning around distressed projects, driving Agile/DevOps transformation, and reducing operating costs while improving system reliability and throughput. Actively applies AI-assisted development tools — Claude Code, Claude Desktop, and Microsoft Copilot — to accelerate business and technical documentation and to build AI agentic workflows that enforce coding best practices.</w:t>
+        <w:t xml:space="preserve">Senior IT leader with 30+ years of experience spanning DevOps, cloud infrastructure, software architecture, and quality assurance, including 10+ years in senior management. Proven record of building and scaling technical teams of up to 45 people (onshore/offshore) and modernizing enterprise systems for Fortune 500 organizations. Skilled at turning around distressed projects, driving Agile/DevOps transformation, and reducing operating costs while improving system reliability and throughput. Actively applies AI-assisted development tools — Claude, Github CoPilot, and Grok — to accelerate business and technical documentation and to build AI agentic workflows that enforce coding best practices.</w:t>
       </w:r>
     </w:p>
     <w:p>
@@ -160,7 +160,7 @@
           <w:sz w:val="20"/>
           <w:szCs w:val="20"/>
         </w:rPr>
-        <w:t xml:space="preserve">Early adopter of AI-assisted development platforms (Claude Code, Claude Desktop, Microsoft Copilot), building agentic AI workflows that enforce coding best practices and accelerate documentation.</w:t>
+        <w:t xml:space="preserve">Early adopter of AI-assisted development platforms (Claude, Github CoPilot, and Grok), building agentic AI workflows that enforce coding best practices and accelerate documentation.</w:t>
       </w:r>
     </w:p>
     <w:p>
@@ -731,7 +731,7 @@
                 <w:sz w:val="19"/>
                 <w:szCs w:val="19"/>
               </w:rPr>
-              <w:t xml:space="preserve">AI-Assisted Development (Claude Code, Copilot)</w:t>
+              <w:t xml:space="preserve">AI-Assisted Development (Claude, Github CoPilot, Grok)</w:t>
             </w:r>
           </w:p>
         </w:tc>

</xml_diff>